<commit_message>
Se implementa nuevomodulo ocigenos INFRA
</commit_message>
<xml_diff>
--- a/backend/apps/recepcion/Ficha cita medica.docx
+++ b/backend/apps/recepcion/Ficha cita medica.docx
@@ -2345,14 +2345,17 @@
                               <w:spacing w:after="0"/>
                               <w:jc w:val="center"/>
                             </w:pPr>
+                            <w:proofErr w:type="spellStart"/>
+                            <w:r>
+                              <w:t>N°</w:t>
+                            </w:r>
+                            <w:proofErr w:type="spellEnd"/>
+                            <w:r>
+                              <w:t xml:space="preserve">. </w:t>
+                            </w:r>
                             <w:r>
                               <w:t xml:space="preserve">FICHA </w:t>
                             </w:r>
-                            <w:proofErr w:type="spellStart"/>
-                            <w:r>
-                              <w:t>N°</w:t>
-                            </w:r>
-                            <w:proofErr w:type="spellEnd"/>
                           </w:p>
                         </w:txbxContent>
                       </wps:txbx>
@@ -2385,14 +2388,17 @@
                         <w:spacing w:after="0"/>
                         <w:jc w:val="center"/>
                       </w:pPr>
+                      <w:proofErr w:type="spellStart"/>
+                      <w:r>
+                        <w:t>N°</w:t>
+                      </w:r>
+                      <w:proofErr w:type="spellEnd"/>
+                      <w:r>
+                        <w:t xml:space="preserve">. </w:t>
+                      </w:r>
                       <w:r>
                         <w:t xml:space="preserve">FICHA </w:t>
                       </w:r>
-                      <w:proofErr w:type="spellStart"/>
-                      <w:r>
-                        <w:t>N°</w:t>
-                      </w:r>
-                      <w:proofErr w:type="spellEnd"/>
                     </w:p>
                   </w:txbxContent>
                 </v:textbox>
@@ -2866,6 +2872,138 @@
         <mc:AlternateContent>
           <mc:Choice Requires="wps">
             <w:drawing>
+              <wp:anchor distT="45720" distB="45720" distL="114300" distR="114300" simplePos="0" relativeHeight="251727872" behindDoc="1" locked="0" layoutInCell="1" allowOverlap="1" wp14:anchorId="3FE70440" wp14:editId="5D56BDE2">
+                <wp:simplePos x="0" y="0"/>
+                <wp:positionH relativeFrom="margin">
+                  <wp:align>left</wp:align>
+                </wp:positionH>
+                <wp:positionV relativeFrom="paragraph">
+                  <wp:posOffset>1405283</wp:posOffset>
+                </wp:positionV>
+                <wp:extent cx="6153785" cy="246490"/>
+                <wp:effectExtent l="0" t="0" r="0" b="1270"/>
+                <wp:wrapNone/>
+                <wp:docPr id="217" name="Cuadro de texto 2"/>
+                <wp:cNvGraphicFramePr>
+                  <a:graphicFrameLocks xmlns:a="http://schemas.openxmlformats.org/drawingml/2006/main"/>
+                </wp:cNvGraphicFramePr>
+                <a:graphic xmlns:a="http://schemas.openxmlformats.org/drawingml/2006/main">
+                  <a:graphicData uri="http://schemas.microsoft.com/office/word/2010/wordprocessingShape">
+                    <wps:wsp>
+                      <wps:cNvSpPr txBox="1">
+                        <a:spLocks noChangeArrowheads="1"/>
+                      </wps:cNvSpPr>
+                      <wps:spPr bwMode="auto">
+                        <a:xfrm>
+                          <a:off x="0" y="0"/>
+                          <a:ext cx="6153785" cy="246490"/>
+                        </a:xfrm>
+                        <a:prstGeom prst="rect">
+                          <a:avLst/>
+                        </a:prstGeom>
+                        <a:solidFill>
+                          <a:srgbClr val="FFFFFF"/>
+                        </a:solidFill>
+                        <a:ln w="9525">
+                          <a:noFill/>
+                          <a:miter lim="800000"/>
+                          <a:headEnd/>
+                          <a:tailEnd/>
+                        </a:ln>
+                      </wps:spPr>
+                      <wps:txbx>
+                        <w:txbxContent>
+                          <w:p>
+                            <w:pPr>
+                              <w:pBdr>
+                                <w:bottom w:val="single" w:sz="4" w:space="1" w:color="auto"/>
+                              </w:pBdr>
+                              <w:rPr>
+                                <w:sz w:val="16"/>
+                                <w:szCs w:val="16"/>
+                              </w:rPr>
+                            </w:pPr>
+                            <w:r>
+                              <w:rPr>
+                                <w:sz w:val="16"/>
+                                <w:szCs w:val="16"/>
+                              </w:rPr>
+                              <w:t>PARA CONSERVAR SU CITA, ES NECESARIO PRESENTARSE 30 MINUTOS ANTES. SI NO CUMPLE ESTE REQUISITO, LA CITA SERÁ CANCELADA</w:t>
+                            </w:r>
+                            <w:r>
+                              <w:rPr>
+                                <w:sz w:val="16"/>
+                                <w:szCs w:val="16"/>
+                              </w:rPr>
+                              <w:t>.</w:t>
+                            </w:r>
+                          </w:p>
+                        </w:txbxContent>
+                      </wps:txbx>
+                      <wps:bodyPr rot="0" vert="horz" wrap="square" lIns="91440" tIns="45720" rIns="91440" bIns="45720" anchor="t" anchorCtr="0">
+                        <a:noAutofit/>
+                      </wps:bodyPr>
+                    </wps:wsp>
+                  </a:graphicData>
+                </a:graphic>
+                <wp14:sizeRelH relativeFrom="margin">
+                  <wp14:pctWidth>0</wp14:pctWidth>
+                </wp14:sizeRelH>
+                <wp14:sizeRelV relativeFrom="margin">
+                  <wp14:pctHeight>0</wp14:pctHeight>
+                </wp14:sizeRelV>
+              </wp:anchor>
+            </w:drawing>
+          </mc:Choice>
+          <mc:Fallback>
+            <w:pict>
+              <v:shapetype w14:anchorId="3FE70440" id="_x0000_t202" coordsize="21600,21600" o:spt="202" path="m,l,21600r21600,l21600,xe">
+                <v:stroke joinstyle="miter"/>
+                <v:path gradientshapeok="t" o:connecttype="rect"/>
+              </v:shapetype>
+              <v:shape id="Cuadro de texto 2" o:spid="_x0000_s1050" type="#_x0000_t202" style="position:absolute;margin-left:0;margin-top:110.65pt;width:484.55pt;height:19.4pt;z-index:-251588608;visibility:visible;mso-wrap-style:square;mso-width-percent:0;mso-height-percent:0;mso-wrap-distance-left:9pt;mso-wrap-distance-top:3.6pt;mso-wrap-distance-right:9pt;mso-wrap-distance-bottom:3.6pt;mso-position-horizontal:left;mso-position-horizontal-relative:margin;mso-position-vertical:absolute;mso-position-vertical-relative:text;mso-width-percent:0;mso-height-percent:0;mso-width-relative:margin;mso-height-relative:margin;v-text-anchor:top" o:gfxdata="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" stroked="f">
+                <v:textbox>
+                  <w:txbxContent>
+                    <w:p>
+                      <w:pPr>
+                        <w:pBdr>
+                          <w:bottom w:val="single" w:sz="4" w:space="1" w:color="auto"/>
+                        </w:pBdr>
+                        <w:rPr>
+                          <w:sz w:val="16"/>
+                          <w:szCs w:val="16"/>
+                        </w:rPr>
+                      </w:pPr>
+                      <w:r>
+                        <w:rPr>
+                          <w:sz w:val="16"/>
+                          <w:szCs w:val="16"/>
+                        </w:rPr>
+                        <w:t>PARA CONSERVAR SU CITA, ES NECESARIO PRESENTARSE 30 MINUTOS ANTES. SI NO CUMPLE ESTE REQUISITO, LA CITA SERÁ CANCELADA</w:t>
+                      </w:r>
+                      <w:r>
+                        <w:rPr>
+                          <w:sz w:val="16"/>
+                          <w:szCs w:val="16"/>
+                        </w:rPr>
+                        <w:t>.</w:t>
+                      </w:r>
+                    </w:p>
+                  </w:txbxContent>
+                </v:textbox>
+                <w10:wrap anchorx="margin"/>
+              </v:shape>
+            </w:pict>
+          </mc:Fallback>
+        </mc:AlternateContent>
+      </w:r>
+      <w:r>
+        <w:rPr>
+          <w:noProof/>
+        </w:rPr>
+        <mc:AlternateContent>
+          <mc:Choice Requires="wps">
+            <w:drawing>
               <wp:anchor distT="0" distB="0" distL="114300" distR="114300" simplePos="0" relativeHeight="251709440" behindDoc="0" locked="0" layoutInCell="1" allowOverlap="1" wp14:anchorId="4D216A8D" wp14:editId="3481AB37">
                 <wp:simplePos x="0" y="0"/>
                 <wp:positionH relativeFrom="leftMargin">
@@ -2950,7 +3088,7 @@
           </mc:Choice>
           <mc:Fallback>
             <w:pict>
-              <v:roundrect w14:anchorId="4D216A8D" id="Rectángulo: esquinas redondeadas 70" o:spid="_x0000_s1050" style="position:absolute;margin-left:480.35pt;margin-top:54.05pt;width:96.9pt;height:23.8pt;z-index:251709440;visibility:visible;mso-wrap-style:square;mso-width-percent:0;mso-height-percent:0;mso-wrap-distance-left:9pt;mso-wrap-distance-top:0;mso-wrap-distance-right:9pt;mso-wrap-distance-bottom:0;mso-position-horizontal:absolute;mso-position-horizontal-relative:left-margin-area;mso-position-vertical:absolute;mso-position-vertical-relative:text;mso-width-percent:0;mso-height-percent:0;mso-width-relative:margin;mso-height-relative:margin;v-text-anchor:middle" arcsize="10923f" o:gfxdata="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" fillcolor="white [3201]" strokecolor="black [3200]" strokeweight="1pt">
+              <v:roundrect w14:anchorId="4D216A8D" id="Rectángulo: esquinas redondeadas 70" o:spid="_x0000_s1051" style="position:absolute;margin-left:480.35pt;margin-top:54.05pt;width:96.9pt;height:23.8pt;z-index:251709440;visibility:visible;mso-wrap-style:square;mso-width-percent:0;mso-height-percent:0;mso-wrap-distance-left:9pt;mso-wrap-distance-top:0;mso-wrap-distance-right:9pt;mso-wrap-distance-bottom:0;mso-position-horizontal:absolute;mso-position-horizontal-relative:left-margin-area;mso-position-vertical:absolute;mso-position-vertical-relative:text;mso-width-percent:0;mso-height-percent:0;mso-width-relative:margin;mso-height-relative:margin;v-text-anchor:middle" arcsize="10923f" o:gfxdata="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" fillcolor="white [3201]" strokecolor="black [3200]" strokeweight="1pt">
                 <v:stroke joinstyle="miter"/>
                 <v:textbox>
                   <w:txbxContent>
@@ -3047,9 +3185,6 @@
                             <w:r>
                               <w:t>}}</w:t>
                             </w:r>
-                            <w:r>
-                              <w:t>2.91</w:t>
-                            </w:r>
                           </w:p>
                           <w:p>
                             <w:pPr>
@@ -3079,7 +3214,7 @@
           </mc:Choice>
           <mc:Fallback>
             <w:pict>
-              <v:roundrect w14:anchorId="7EAE2C5C" id="Rectángulo: esquinas redondeadas 104" o:spid="_x0000_s1051" style="position:absolute;margin-left:409.35pt;margin-top:78.05pt;width:96.9pt;height:23.8pt;z-index:251725824;visibility:visible;mso-wrap-style:square;mso-width-percent:0;mso-height-percent:0;mso-wrap-distance-left:9pt;mso-wrap-distance-top:0;mso-wrap-distance-right:9pt;mso-wrap-distance-bottom:0;mso-position-horizontal:absolute;mso-position-horizontal-relative:margin;mso-position-vertical:absolute;mso-position-vertical-relative:text;mso-width-percent:0;mso-height-percent:0;mso-width-relative:margin;mso-height-relative:margin;v-text-anchor:middle" arcsize="10923f" o:gfxdata="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" fillcolor="white [3201]" strokecolor="black [3200]" strokeweight="1pt">
+              <v:roundrect w14:anchorId="7EAE2C5C" id="Rectángulo: esquinas redondeadas 104" o:spid="_x0000_s1052" style="position:absolute;margin-left:409.35pt;margin-top:78.05pt;width:96.9pt;height:23.8pt;z-index:251725824;visibility:visible;mso-wrap-style:square;mso-width-percent:0;mso-height-percent:0;mso-wrap-distance-left:9pt;mso-wrap-distance-top:0;mso-wrap-distance-right:9pt;mso-wrap-distance-bottom:0;mso-position-horizontal:absolute;mso-position-horizontal-relative:margin;mso-position-vertical:absolute;mso-position-vertical-relative:text;mso-width-percent:0;mso-height-percent:0;mso-width-relative:margin;mso-height-relative:margin;v-text-anchor:middle" arcsize="10923f" o:gfxdata="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" fillcolor="white [3201]" strokecolor="black [3200]" strokeweight="1pt">
                 <v:stroke joinstyle="miter"/>
                 <v:textbox>
                   <w:txbxContent>
@@ -3098,9 +3233,6 @@
                       <w:proofErr w:type="spellEnd"/>
                       <w:r>
                         <w:t>}}</w:t>
-                      </w:r>
-                      <w:r>
-                        <w:t>2.91</w:t>
                       </w:r>
                     </w:p>
                     <w:p>
@@ -3205,7 +3337,7 @@
           </mc:Choice>
           <mc:Fallback>
             <w:pict>
-              <v:roundrect w14:anchorId="1392BD64" id="Rectángulo: esquinas redondeadas 103" o:spid="_x0000_s1052" style="position:absolute;margin-left:344.35pt;margin-top:77.9pt;width:136.05pt;height:23.8pt;z-index:251723776;visibility:visible;mso-wrap-style:square;mso-width-percent:0;mso-height-percent:0;mso-wrap-distance-left:9pt;mso-wrap-distance-top:0;mso-wrap-distance-right:9pt;mso-wrap-distance-bottom:0;mso-position-horizontal:absolute;mso-position-horizontal-relative:left-margin-area;mso-position-vertical:absolute;mso-position-vertical-relative:text;mso-width-percent:0;mso-height-percent:0;mso-width-relative:margin;mso-height-relative:margin;v-text-anchor:middle" arcsize="10923f" o:gfxdata="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" fillcolor="white [3201]" strokecolor="black [3200]" strokeweight="1pt">
+              <v:roundrect w14:anchorId="1392BD64" id="Rectángulo: esquinas redondeadas 103" o:spid="_x0000_s1053" style="position:absolute;margin-left:344.35pt;margin-top:77.9pt;width:136.05pt;height:23.8pt;z-index:251723776;visibility:visible;mso-wrap-style:square;mso-width-percent:0;mso-height-percent:0;mso-wrap-distance-left:9pt;mso-wrap-distance-top:0;mso-wrap-distance-right:9pt;mso-wrap-distance-bottom:0;mso-position-horizontal:absolute;mso-position-horizontal-relative:left-margin-area;mso-position-vertical:absolute;mso-position-vertical-relative:text;mso-width-percent:0;mso-height-percent:0;mso-width-relative:margin;mso-height-relative:margin;v-text-anchor:middle" arcsize="10923f" o:gfxdata="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" fillcolor="white [3201]" strokecolor="black [3200]" strokeweight="1pt">
                 <v:stroke joinstyle="miter"/>
                 <v:textbox>
                   <w:txbxContent>
@@ -3314,7 +3446,7 @@
           </mc:Choice>
           <mc:Fallback>
             <w:pict>
-              <v:roundrect w14:anchorId="5E944AAB" id="Rectángulo: esquinas redondeadas 67" o:spid="_x0000_s1053" style="position:absolute;margin-left:344.45pt;margin-top:54.1pt;width:136.05pt;height:23.8pt;z-index:251707392;visibility:visible;mso-wrap-style:square;mso-width-percent:0;mso-height-percent:0;mso-wrap-distance-left:9pt;mso-wrap-distance-top:0;mso-wrap-distance-right:9pt;mso-wrap-distance-bottom:0;mso-position-horizontal:absolute;mso-position-horizontal-relative:left-margin-area;mso-position-vertical:absolute;mso-position-vertical-relative:text;mso-width-percent:0;mso-height-percent:0;mso-width-relative:margin;mso-height-relative:margin;v-text-anchor:middle" arcsize="10923f" o:gfxdata="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" fillcolor="white [3201]" strokecolor="black [3200]" strokeweight="1pt">
+              <v:roundrect w14:anchorId="5E944AAB" id="Rectángulo: esquinas redondeadas 67" o:spid="_x0000_s1054" style="position:absolute;margin-left:344.45pt;margin-top:54.1pt;width:136.05pt;height:23.8pt;z-index:251707392;visibility:visible;mso-wrap-style:square;mso-width-percent:0;mso-height-percent:0;mso-wrap-distance-left:9pt;mso-wrap-distance-top:0;mso-wrap-distance-right:9pt;mso-wrap-distance-bottom:0;mso-position-horizontal:absolute;mso-position-horizontal-relative:left-margin-area;mso-position-vertical:absolute;mso-position-vertical-relative:text;mso-width-percent:0;mso-height-percent:0;mso-width-relative:margin;mso-height-relative:margin;v-text-anchor:middle" arcsize="10923f" o:gfxdata="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" fillcolor="white [3201]" strokecolor="black [3200]" strokeweight="1pt">
                 <v:stroke joinstyle="miter"/>
                 <v:textbox>
                   <w:txbxContent>
@@ -3415,7 +3547,7 @@
           </mc:Choice>
           <mc:Fallback>
             <w:pict>
-              <v:roundrect w14:anchorId="1B7ECC35" id="Rectángulo: esquinas redondeadas 64" o:spid="_x0000_s1054" style="position:absolute;margin-left:255.55pt;margin-top:54.1pt;width:88.7pt;height:23.8pt;z-index:251705344;visibility:visible;mso-wrap-style:square;mso-width-percent:0;mso-height-percent:0;mso-wrap-distance-left:9pt;mso-wrap-distance-top:0;mso-wrap-distance-right:9pt;mso-wrap-distance-bottom:0;mso-position-horizontal:absolute;mso-position-horizontal-relative:left-margin-area;mso-position-vertical:absolute;mso-position-vertical-relative:text;mso-width-percent:0;mso-height-percent:0;mso-width-relative:margin;mso-height-relative:margin;v-text-anchor:middle" arcsize="10923f" o:gfxdata="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" fillcolor="white [3201]" strokecolor="black [3200]" strokeweight="1pt">
+              <v:roundrect w14:anchorId="1B7ECC35" id="Rectángulo: esquinas redondeadas 64" o:spid="_x0000_s1055" style="position:absolute;margin-left:255.55pt;margin-top:54.1pt;width:88.7pt;height:23.8pt;z-index:251705344;visibility:visible;mso-wrap-style:square;mso-width-percent:0;mso-height-percent:0;mso-wrap-distance-left:9pt;mso-wrap-distance-top:0;mso-wrap-distance-right:9pt;mso-wrap-distance-bottom:0;mso-position-horizontal:absolute;mso-position-horizontal-relative:left-margin-area;mso-position-vertical:absolute;mso-position-vertical-relative:text;mso-width-percent:0;mso-height-percent:0;mso-width-relative:margin;mso-height-relative:margin;v-text-anchor:middle" arcsize="10923f" o:gfxdata="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" fillcolor="white [3201]" strokecolor="black [3200]" strokeweight="1pt">
                 <v:stroke joinstyle="miter"/>
                 <v:textbox>
                   <w:txbxContent>
@@ -3516,7 +3648,7 @@
           </mc:Choice>
           <mc:Fallback>
             <w:pict>
-              <v:roundrect w14:anchorId="1979BBFF" id="Rectángulo: esquinas redondeadas 102" o:spid="_x0000_s1055" style="position:absolute;margin-left:256pt;margin-top:77.75pt;width:88.65pt;height:23.8pt;z-index:251721728;visibility:visible;mso-wrap-style:square;mso-width-percent:0;mso-height-percent:0;mso-wrap-distance-left:9pt;mso-wrap-distance-top:0;mso-wrap-distance-right:9pt;mso-wrap-distance-bottom:0;mso-position-horizontal:absolute;mso-position-horizontal-relative:left-margin-area;mso-position-vertical:absolute;mso-position-vertical-relative:text;mso-width-percent:0;mso-height-percent:0;mso-width-relative:margin;mso-height-relative:margin;v-text-anchor:middle" arcsize="10923f" o:gfxdata="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" fillcolor="white [3201]" strokecolor="black [3200]" strokeweight="1pt">
+              <v:roundrect w14:anchorId="1979BBFF" id="Rectángulo: esquinas redondeadas 102" o:spid="_x0000_s1056" style="position:absolute;margin-left:256pt;margin-top:77.75pt;width:88.65pt;height:23.8pt;z-index:251721728;visibility:visible;mso-wrap-style:square;mso-width-percent:0;mso-height-percent:0;mso-wrap-distance-left:9pt;mso-wrap-distance-top:0;mso-wrap-distance-right:9pt;mso-wrap-distance-bottom:0;mso-position-horizontal:absolute;mso-position-horizontal-relative:left-margin-area;mso-position-vertical:absolute;mso-position-vertical-relative:text;mso-width-percent:0;mso-height-percent:0;mso-width-relative:margin;mso-height-relative:margin;v-text-anchor:middle" arcsize="10923f" o:gfxdata="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" fillcolor="white [3201]" strokecolor="black [3200]" strokeweight="1pt">
                 <v:stroke joinstyle="miter"/>
                 <v:textbox>
                   <w:txbxContent>
@@ -3666,7 +3798,7 @@
           </mc:Choice>
           <mc:Fallback>
             <w:pict>
-              <v:roundrect w14:anchorId="40225D58" id="Rectángulo: esquinas redondeadas 61" o:spid="_x0000_s1056" style="position:absolute;margin-left:128.6pt;margin-top:54.1pt;width:127.55pt;height:23.8pt;z-index:251703296;visibility:visible;mso-wrap-style:square;mso-width-percent:0;mso-height-percent:0;mso-wrap-distance-left:9pt;mso-wrap-distance-top:0;mso-wrap-distance-right:9pt;mso-wrap-distance-bottom:0;mso-position-horizontal:absolute;mso-position-horizontal-relative:left-margin-area;mso-position-vertical:absolute;mso-position-vertical-relative:text;mso-width-percent:0;mso-height-percent:0;mso-width-relative:margin;mso-height-relative:margin;v-text-anchor:middle" arcsize="10923f" o:gfxdata="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" fillcolor="white [3201]" strokecolor="black [3200]" strokeweight="1pt">
+              <v:roundrect w14:anchorId="40225D58" id="Rectángulo: esquinas redondeadas 61" o:spid="_x0000_s1057" style="position:absolute;margin-left:128.6pt;margin-top:54.1pt;width:127.55pt;height:23.8pt;z-index:251703296;visibility:visible;mso-wrap-style:square;mso-width-percent:0;mso-height-percent:0;mso-wrap-distance-left:9pt;mso-wrap-distance-top:0;mso-wrap-distance-right:9pt;mso-wrap-distance-bottom:0;mso-position-horizontal:absolute;mso-position-horizontal-relative:left-margin-area;mso-position-vertical:absolute;mso-position-vertical-relative:text;mso-width-percent:0;mso-height-percent:0;mso-width-relative:margin;mso-height-relative:margin;v-text-anchor:middle" arcsize="10923f" o:gfxdata="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" fillcolor="white [3201]" strokecolor="black [3200]" strokeweight="1pt">
                 <v:stroke joinstyle="miter"/>
                 <v:textbox>
                   <w:txbxContent>
@@ -3825,7 +3957,7 @@
           </mc:Choice>
           <mc:Fallback>
             <w:pict>
-              <v:roundrect w14:anchorId="4B4AB016" id="Rectángulo: esquinas redondeadas 97" o:spid="_x0000_s1057" style="position:absolute;margin-left:3.3pt;margin-top:54.05pt;width:54.1pt;height:23.8pt;z-index:251711488;visibility:visible;mso-wrap-style:square;mso-width-percent:0;mso-height-percent:0;mso-wrap-distance-left:9pt;mso-wrap-distance-top:0;mso-wrap-distance-right:9pt;mso-wrap-distance-bottom:0;mso-position-horizontal:absolute;mso-position-horizontal-relative:margin;mso-position-vertical:absolute;mso-position-vertical-relative:text;mso-width-percent:0;mso-height-percent:0;mso-width-relative:margin;mso-height-relative:margin;v-text-anchor:middle" arcsize="10923f" o:gfxdata="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" fillcolor="white [3201]" strokecolor="black [3200]" strokeweight="1pt">
+              <v:roundrect w14:anchorId="4B4AB016" id="Rectángulo: esquinas redondeadas 97" o:spid="_x0000_s1058" style="position:absolute;margin-left:3.3pt;margin-top:54.05pt;width:54.1pt;height:23.8pt;z-index:251711488;visibility:visible;mso-wrap-style:square;mso-width-percent:0;mso-height-percent:0;mso-wrap-distance-left:9pt;mso-wrap-distance-top:0;mso-wrap-distance-right:9pt;mso-wrap-distance-bottom:0;mso-position-horizontal:absolute;mso-position-horizontal-relative:margin;mso-position-vertical:absolute;mso-position-vertical-relative:text;mso-width-percent:0;mso-height-percent:0;mso-width-relative:margin;mso-height-relative:margin;v-text-anchor:middle" arcsize="10923f" o:gfxdata="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" fillcolor="white [3201]" strokecolor="black [3200]" strokeweight="1pt">
                 <v:stroke joinstyle="miter"/>
                 <v:textbox>
                   <w:txbxContent>
@@ -3957,7 +4089,7 @@
           </mc:Choice>
           <mc:Fallback>
             <w:pict>
-              <v:roundrect w14:anchorId="6BC155A3" id="Rectángulo: esquinas redondeadas 101" o:spid="_x0000_s1058" style="position:absolute;margin-left:128.5pt;margin-top:77.65pt;width:127.55pt;height:23.8pt;z-index:251719680;visibility:visible;mso-wrap-style:square;mso-width-percent:0;mso-height-percent:0;mso-wrap-distance-left:9pt;mso-wrap-distance-top:0;mso-wrap-distance-right:9pt;mso-wrap-distance-bottom:0;mso-position-horizontal:absolute;mso-position-horizontal-relative:left-margin-area;mso-position-vertical:absolute;mso-position-vertical-relative:text;mso-width-percent:0;mso-height-percent:0;mso-width-relative:margin;mso-height-relative:margin;v-text-anchor:middle" arcsize="10923f" o:gfxdata="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" fillcolor="white [3201]" strokecolor="black [3200]" strokeweight="1pt">
+              <v:roundrect w14:anchorId="6BC155A3" id="Rectángulo: esquinas redondeadas 101" o:spid="_x0000_s1059" style="position:absolute;margin-left:128.5pt;margin-top:77.65pt;width:127.55pt;height:23.8pt;z-index:251719680;visibility:visible;mso-wrap-style:square;mso-width-percent:0;mso-height-percent:0;mso-wrap-distance-left:9pt;mso-wrap-distance-top:0;mso-wrap-distance-right:9pt;mso-wrap-distance-bottom:0;mso-position-horizontal:absolute;mso-position-horizontal-relative:left-margin-area;mso-position-vertical:absolute;mso-position-vertical-relative:text;mso-width-percent:0;mso-height-percent:0;mso-width-relative:margin;mso-height-relative:margin;v-text-anchor:middle" arcsize="10923f" o:gfxdata="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" fillcolor="white [3201]" strokecolor="black [3200]" strokeweight="1pt">
                 <v:stroke joinstyle="miter"/>
                 <v:textbox>
                   <w:txbxContent>
@@ -4080,7 +4212,7 @@
           </mc:Choice>
           <mc:Fallback>
             <w:pict>
-              <v:roundrect w14:anchorId="1B4EBA36" id="Rectángulo: esquinas redondeadas 100" o:spid="_x0000_s1059" style="position:absolute;margin-left:3.05pt;margin-top:77.75pt;width:54.25pt;height:23.8pt;z-index:251717632;visibility:visible;mso-wrap-style:square;mso-width-percent:0;mso-height-percent:0;mso-wrap-distance-left:9pt;mso-wrap-distance-top:0;mso-wrap-distance-right:9pt;mso-wrap-distance-bottom:0;mso-position-horizontal:absolute;mso-position-horizontal-relative:margin;mso-position-vertical:absolute;mso-position-vertical-relative:text;mso-width-percent:0;mso-height-percent:0;mso-width-relative:margin;mso-height-relative:margin;v-text-anchor:middle" arcsize="10923f" o:gfxdata="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" fillcolor="white [3201]" strokecolor="black [3200]" strokeweight="1pt">
+              <v:roundrect w14:anchorId="1B4EBA36" id="Rectángulo: esquinas redondeadas 100" o:spid="_x0000_s1060" style="position:absolute;margin-left:3.05pt;margin-top:77.75pt;width:54.25pt;height:23.8pt;z-index:251717632;visibility:visible;mso-wrap-style:square;mso-width-percent:0;mso-height-percent:0;mso-wrap-distance-left:9pt;mso-wrap-distance-top:0;mso-wrap-distance-right:9pt;mso-wrap-distance-bottom:0;mso-position-horizontal:absolute;mso-position-horizontal-relative:margin;mso-position-vertical:absolute;mso-position-vertical-relative:text;mso-width-percent:0;mso-height-percent:0;mso-width-relative:margin;mso-height-relative:margin;v-text-anchor:middle" arcsize="10923f" o:gfxdata="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" fillcolor="white [3201]" strokecolor="black [3200]" strokeweight="1pt">
                 <v:stroke joinstyle="miter"/>
                 <v:textbox>
                   <w:txbxContent>
@@ -4181,7 +4313,7 @@
           </mc:Choice>
           <mc:Fallback>
             <w:pict>
-              <v:roundrect w14:anchorId="4E9FCEF4" id="Rectángulo: esquinas redondeadas 99" o:spid="_x0000_s1060" style="position:absolute;margin-left:22pt;margin-top:77.75pt;width:52.1pt;height:23.8pt;z-index:251715584;visibility:visible;mso-wrap-style:square;mso-width-percent:0;mso-height-percent:0;mso-wrap-distance-left:9pt;mso-wrap-distance-top:0;mso-wrap-distance-right:9pt;mso-wrap-distance-bottom:0;mso-position-horizontal:absolute;mso-position-horizontal-relative:left-margin-area;mso-position-vertical:absolute;mso-position-vertical-relative:text;mso-width-percent:0;mso-height-percent:0;mso-width-relative:margin;mso-height-relative:margin;v-text-anchor:middle" arcsize="10923f" o:gfxdata="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" fillcolor="white [3201]" strokecolor="black [3200]" strokeweight="1pt">
+              <v:roundrect w14:anchorId="4E9FCEF4" id="Rectángulo: esquinas redondeadas 99" o:spid="_x0000_s1061" style="position:absolute;margin-left:22pt;margin-top:77.75pt;width:52.1pt;height:23.8pt;z-index:251715584;visibility:visible;mso-wrap-style:square;mso-width-percent:0;mso-height-percent:0;mso-wrap-distance-left:9pt;mso-wrap-distance-top:0;mso-wrap-distance-right:9pt;mso-wrap-distance-bottom:0;mso-position-horizontal:absolute;mso-position-horizontal-relative:left-margin-area;mso-position-vertical:absolute;mso-position-vertical-relative:text;mso-width-percent:0;mso-height-percent:0;mso-width-relative:margin;mso-height-relative:margin;v-text-anchor:middle" arcsize="10923f" o:gfxdata="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" fillcolor="white [3201]" strokecolor="black [3200]" strokeweight="1pt">
                 <v:stroke joinstyle="miter"/>
                 <v:textbox>
                   <w:txbxContent>
@@ -4209,7 +4341,7 @@
         <mc:AlternateContent>
           <mc:Choice Requires="wps">
             <w:drawing>
-              <wp:anchor distT="0" distB="0" distL="114300" distR="114300" simplePos="0" relativeHeight="251713536" behindDoc="0" locked="0" layoutInCell="1" allowOverlap="1" wp14:anchorId="2C17527E" wp14:editId="0E6D4BEE">
+              <wp:anchor distT="0" distB="0" distL="114300" distR="114300" simplePos="0" relativeHeight="251713536" behindDoc="0" locked="0" layoutInCell="1" allowOverlap="1" wp14:anchorId="2C17527E" wp14:editId="234B485C">
                 <wp:simplePos x="0" y="0"/>
                 <wp:positionH relativeFrom="leftMargin">
                   <wp:posOffset>280035</wp:posOffset>
@@ -4282,7 +4414,7 @@
           </mc:Choice>
           <mc:Fallback>
             <w:pict>
-              <v:roundrect w14:anchorId="2C17527E" id="Rectángulo: esquinas redondeadas 98" o:spid="_x0000_s1061" style="position:absolute;margin-left:22.05pt;margin-top:54.05pt;width:52.15pt;height:23.8pt;z-index:251713536;visibility:visible;mso-wrap-style:square;mso-width-percent:0;mso-height-percent:0;mso-wrap-distance-left:9pt;mso-wrap-distance-top:0;mso-wrap-distance-right:9pt;mso-wrap-distance-bottom:0;mso-position-horizontal:absolute;mso-position-horizontal-relative:left-margin-area;mso-position-vertical:absolute;mso-position-vertical-relative:text;mso-width-percent:0;mso-height-percent:0;mso-width-relative:margin;mso-height-relative:margin;v-text-anchor:middle" arcsize="10923f" o:gfxdata="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" fillcolor="white [3201]" strokecolor="black [3200]" strokeweight="1pt">
+              <v:roundrect w14:anchorId="2C17527E" id="Rectángulo: esquinas redondeadas 98" o:spid="_x0000_s1062" style="position:absolute;margin-left:22.05pt;margin-top:54.05pt;width:52.15pt;height:23.8pt;z-index:251713536;visibility:visible;mso-wrap-style:square;mso-width-percent:0;mso-height-percent:0;mso-wrap-distance-left:9pt;mso-wrap-distance-top:0;mso-wrap-distance-right:9pt;mso-wrap-distance-bottom:0;mso-position-horizontal:absolute;mso-position-horizontal-relative:left-margin-area;mso-position-vertical:absolute;mso-position-vertical-relative:text;mso-width-percent:0;mso-height-percent:0;mso-width-relative:margin;mso-height-relative:margin;v-text-anchor:middle" arcsize="10923f" o:gfxdata="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" fillcolor="white [3201]" strokecolor="black [3200]" strokeweight="1pt">
                 <v:stroke joinstyle="miter"/>
                 <v:textbox>
                   <w:txbxContent>
@@ -4299,138 +4431,6 @@
                 </v:textbox>
                 <w10:wrap anchorx="margin"/>
               </v:roundrect>
-            </w:pict>
-          </mc:Fallback>
-        </mc:AlternateContent>
-      </w:r>
-      <w:r>
-        <w:rPr>
-          <w:noProof/>
-        </w:rPr>
-        <mc:AlternateContent>
-          <mc:Choice Requires="wps">
-            <w:drawing>
-              <wp:anchor distT="45720" distB="45720" distL="114300" distR="114300" simplePos="0" relativeHeight="251727872" behindDoc="1" locked="0" layoutInCell="1" allowOverlap="1" wp14:anchorId="3FE70440" wp14:editId="120CC1A3">
-                <wp:simplePos x="0" y="0"/>
-                <wp:positionH relativeFrom="margin">
-                  <wp:posOffset>0</wp:posOffset>
-                </wp:positionH>
-                <wp:positionV relativeFrom="paragraph">
-                  <wp:posOffset>1407160</wp:posOffset>
-                </wp:positionV>
-                <wp:extent cx="6153785" cy="196215"/>
-                <wp:effectExtent l="0" t="0" r="0" b="0"/>
-                <wp:wrapNone/>
-                <wp:docPr id="217" name="Cuadro de texto 2"/>
-                <wp:cNvGraphicFramePr>
-                  <a:graphicFrameLocks xmlns:a="http://schemas.openxmlformats.org/drawingml/2006/main"/>
-                </wp:cNvGraphicFramePr>
-                <a:graphic xmlns:a="http://schemas.openxmlformats.org/drawingml/2006/main">
-                  <a:graphicData uri="http://schemas.microsoft.com/office/word/2010/wordprocessingShape">
-                    <wps:wsp>
-                      <wps:cNvSpPr txBox="1">
-                        <a:spLocks noChangeArrowheads="1"/>
-                      </wps:cNvSpPr>
-                      <wps:spPr bwMode="auto">
-                        <a:xfrm>
-                          <a:off x="0" y="0"/>
-                          <a:ext cx="6153785" cy="196215"/>
-                        </a:xfrm>
-                        <a:prstGeom prst="rect">
-                          <a:avLst/>
-                        </a:prstGeom>
-                        <a:solidFill>
-                          <a:srgbClr val="FFFFFF"/>
-                        </a:solidFill>
-                        <a:ln w="9525">
-                          <a:noFill/>
-                          <a:miter lim="800000"/>
-                          <a:headEnd/>
-                          <a:tailEnd/>
-                        </a:ln>
-                      </wps:spPr>
-                      <wps:txbx>
-                        <w:txbxContent>
-                          <w:p>
-                            <w:pPr>
-                              <w:pBdr>
-                                <w:bottom w:val="single" w:sz="4" w:space="1" w:color="auto"/>
-                              </w:pBdr>
-                              <w:rPr>
-                                <w:sz w:val="16"/>
-                                <w:szCs w:val="16"/>
-                              </w:rPr>
-                            </w:pPr>
-                            <w:r>
-                              <w:rPr>
-                                <w:sz w:val="16"/>
-                                <w:szCs w:val="16"/>
-                              </w:rPr>
-                              <w:t>PARA CONSERVAR SU CITA, ES NECESARIO PRESENTARSE 30 MINUTOS ANTES. SI NO CUMPLE ESTE REQUISITO, LA CITA SERÁ CANCELADA</w:t>
-                            </w:r>
-                            <w:r>
-                              <w:rPr>
-                                <w:sz w:val="16"/>
-                                <w:szCs w:val="16"/>
-                              </w:rPr>
-                              <w:t>.</w:t>
-                            </w:r>
-                          </w:p>
-                        </w:txbxContent>
-                      </wps:txbx>
-                      <wps:bodyPr rot="0" vert="horz" wrap="square" lIns="91440" tIns="45720" rIns="91440" bIns="45720" anchor="t" anchorCtr="0">
-                        <a:noAutofit/>
-                      </wps:bodyPr>
-                    </wps:wsp>
-                  </a:graphicData>
-                </a:graphic>
-                <wp14:sizeRelH relativeFrom="margin">
-                  <wp14:pctWidth>0</wp14:pctWidth>
-                </wp14:sizeRelH>
-                <wp14:sizeRelV relativeFrom="margin">
-                  <wp14:pctHeight>0</wp14:pctHeight>
-                </wp14:sizeRelV>
-              </wp:anchor>
-            </w:drawing>
-          </mc:Choice>
-          <mc:Fallback>
-            <w:pict>
-              <v:shapetype w14:anchorId="3FE70440" id="_x0000_t202" coordsize="21600,21600" o:spt="202" path="m,l,21600r21600,l21600,xe">
-                <v:stroke joinstyle="miter"/>
-                <v:path gradientshapeok="t" o:connecttype="rect"/>
-              </v:shapetype>
-              <v:shape id="Cuadro de texto 2" o:spid="_x0000_s1062" type="#_x0000_t202" style="position:absolute;margin-left:0;margin-top:110.8pt;width:484.55pt;height:15.45pt;z-index:-251588608;visibility:visible;mso-wrap-style:square;mso-width-percent:0;mso-height-percent:0;mso-wrap-distance-left:9pt;mso-wrap-distance-top:3.6pt;mso-wrap-distance-right:9pt;mso-wrap-distance-bottom:3.6pt;mso-position-horizontal:absolute;mso-position-horizontal-relative:margin;mso-position-vertical:absolute;mso-position-vertical-relative:text;mso-width-percent:0;mso-height-percent:0;mso-width-relative:margin;mso-height-relative:margin;v-text-anchor:top" o:gfxdata="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" stroked="f">
-                <v:textbox>
-                  <w:txbxContent>
-                    <w:p>
-                      <w:pPr>
-                        <w:pBdr>
-                          <w:bottom w:val="single" w:sz="4" w:space="1" w:color="auto"/>
-                        </w:pBdr>
-                        <w:rPr>
-                          <w:sz w:val="16"/>
-                          <w:szCs w:val="16"/>
-                        </w:rPr>
-                      </w:pPr>
-                      <w:r>
-                        <w:rPr>
-                          <w:sz w:val="16"/>
-                          <w:szCs w:val="16"/>
-                        </w:rPr>
-                        <w:t>PARA CONSERVAR SU CITA, ES NECESARIO PRESENTARSE 30 MINUTOS ANTES. SI NO CUMPLE ESTE REQUISITO, LA CITA SERÁ CANCELADA</w:t>
-                      </w:r>
-                      <w:r>
-                        <w:rPr>
-                          <w:sz w:val="16"/>
-                          <w:szCs w:val="16"/>
-                        </w:rPr>
-                        <w:t>.</w:t>
-                      </w:r>
-                    </w:p>
-                  </w:txbxContent>
-                </v:textbox>
-                <w10:wrap anchorx="margin"/>
-              </v:shape>
             </w:pict>
           </mc:Fallback>
         </mc:AlternateContent>

</xml_diff>